<commit_message>
Restore Bayesian rankings and improve reporting and document tracker
</commit_message>
<xml_diff>
--- a/docs/Admin_Manual.docx
+++ b/docs/Admin_Manual.docx
@@ -5244,7 +5244,7 @@
           <w:sz w:val="21"/>
           <w:szCs w:val="21"/>
         </w:rPr>
-        <w:t xml:space="preserve">Use the category tabs (Supplier – Local, Supplier – Foreign, Courier, Subcontractor) to see the specific document set that applies to each type, and the quick filter chips (All / Expired / Expiring ≤30d / Missing) to narrow the list down. The "Compliance Overview" panel above the grid also gives you KPIs like Total Partners, Compliance Rate, and charts showing which documents most need attention.</w:t>
+        <w:t xml:space="preserve">Use the category tabs (Supplier – Local, Supplier – Foreign, Courier, Subcontractor) to see the specific document set that applies to each type. Search by company name or BP Code above the document grid; results are shown 15 rows per page. Administrators can still use Customize Filters for more specific fields and conditions. The "Compliance Overview" panel above the grid also gives you KPIs like Total Partners, Compliance Rate, and charts showing which documents most need attention.</w:t>
       </w:r>
     </w:p>
     <w:tbl>
@@ -9648,6 +9648,20 @@
           <w:szCs w:val="21"/>
         </w:rPr>
         <w:t xml:space="preserve">A one-company "report card" with charts and a score trend for a single partner — this is also the only report type you can export as a Word document.</w:t>
+      </w:r>
+    </w:p>
+    <w:p>
+      <w:pPr>
+        <w:spacing w:after="160" w:line="288"/>
+      </w:pPr>
+      <w:r>
+        <w:rPr>
+          <w:rFonts w:ascii="Calibri" w:cs="Calibri" w:eastAsia="Calibri" w:hAnsi="Calibri"/>
+          <w:color w:val="334155"/>
+          <w:sz w:val="21"/>
+          <w:szCs w:val="21"/>
+        </w:rPr>
+        <w:t xml:space="preserve">Stakeholder comments include overall feedback and free-text remarks left on survey sections. Each comment is labeled with its section, and repeated copies of the same remark from one respondent and section appear only once.</w:t>
       </w:r>
     </w:p>
     <w:p>

</xml_diff>

<commit_message>
Remove supplier ranking module and update evaluation access
</commit_message>
<xml_diff>
--- a/docs/Admin_Manual.docx
+++ b/docs/Admin_Manual.docx
@@ -828,7 +828,7 @@
           <w:sz w:val="21"/>
           <w:szCs w:val="21"/>
         </w:rPr>
-        <w:t xml:space="preserve">Supplier Ranking — choosing your Top 20 evaluable Suppliers</w:t>
+        <w:t xml:space="preserve">Feedback Hub — sending performance reports to partner companies</w:t>
       </w:r>
       <w:r>
         <w:rPr>
@@ -847,6 +847,43 @@
           <w:szCs w:val="21"/>
         </w:rPr>
         <w:t xml:space="preserve">16</w:t>
+      </w:r>
+    </w:p>
+    <w:p>
+      <w:pPr>
+        <w:tabs>
+          <w:tab w:val="right" w:pos="9026" w:leader="dot"/>
+        </w:tabs>
+        <w:spacing w:after="120" w:before="160"/>
+      </w:pPr>
+      <w:r>
+        <w:rPr>
+          <w:rFonts w:ascii="Calibri" w:cs="Calibri" w:eastAsia="Calibri" w:hAnsi="Calibri"/>
+          <w:b/>
+          <w:bCs/>
+          <w:color w:val="0063A9"/>
+          <w:sz w:val="23"/>
+          <w:szCs w:val="23"/>
+        </w:rPr>
+        <w:t xml:space="preserve">Chapter 6: Evaluations</w:t>
+      </w:r>
+      <w:r>
+        <w:rPr>
+          <w:sz w:val="21"/>
+          <w:szCs w:val="21"/>
+        </w:rPr>
+        <w:t xml:space="preserve">	</w:t>
+      </w:r>
+      <w:r>
+        <w:rPr>
+          <w:rFonts w:ascii="Calibri" w:cs="Calibri" w:eastAsia="Calibri" w:hAnsi="Calibri"/>
+          <w:b/>
+          <w:bCs/>
+          <w:color w:val="0063A9"/>
+          <w:sz w:val="23"/>
+          <w:szCs w:val="23"/>
+        </w:rPr>
+        <w:t xml:space="preserve">18</w:t>
       </w:r>
     </w:p>
     <w:p>
@@ -866,7 +903,7 @@
           <w:sz w:val="21"/>
           <w:szCs w:val="21"/>
         </w:rPr>
-        <w:t xml:space="preserve">Feedback Hub — sending performance reports to partner companies</w:t>
+        <w:t xml:space="preserve">All Submissions — managing your survey forms</w:t>
       </w:r>
       <w:r>
         <w:rPr>
@@ -884,44 +921,7 @@
           <w:sz w:val="21"/>
           <w:szCs w:val="21"/>
         </w:rPr>
-        <w:t xml:space="preserve">17</w:t>
-      </w:r>
-    </w:p>
-    <w:p>
-      <w:pPr>
-        <w:tabs>
-          <w:tab w:val="right" w:pos="9026" w:leader="dot"/>
-        </w:tabs>
-        <w:spacing w:after="120" w:before="160"/>
-      </w:pPr>
-      <w:r>
-        <w:rPr>
-          <w:rFonts w:ascii="Calibri" w:cs="Calibri" w:eastAsia="Calibri" w:hAnsi="Calibri"/>
-          <w:b/>
-          <w:bCs/>
-          <w:color w:val="0063A9"/>
-          <w:sz w:val="23"/>
-          <w:szCs w:val="23"/>
-        </w:rPr>
-        <w:t xml:space="preserve">Chapter 6: Evaluations</w:t>
-      </w:r>
-      <w:r>
-        <w:rPr>
-          <w:sz w:val="21"/>
-          <w:szCs w:val="21"/>
-        </w:rPr>
-        <w:t xml:space="preserve">	</w:t>
-      </w:r>
-      <w:r>
-        <w:rPr>
-          <w:rFonts w:ascii="Calibri" w:cs="Calibri" w:eastAsia="Calibri" w:hAnsi="Calibri"/>
-          <w:b/>
-          <w:bCs/>
-          <w:color w:val="0063A9"/>
-          <w:sz w:val="23"/>
-          <w:szCs w:val="23"/>
-        </w:rPr>
-        <w:t xml:space="preserve">19</w:t>
+        <w:t xml:space="preserve">18</w:t>
       </w:r>
     </w:p>
     <w:p>
@@ -941,7 +941,7 @@
           <w:sz w:val="21"/>
           <w:szCs w:val="21"/>
         </w:rPr>
-        <w:t xml:space="preserve">All Submissions — managing your survey forms</w:t>
+        <w:t xml:space="preserve">Outstanding Evaluations — who still needs to be evaluated</w:t>
       </w:r>
       <w:r>
         <w:rPr>
@@ -959,7 +959,7 @@
           <w:sz w:val="21"/>
           <w:szCs w:val="21"/>
         </w:rPr>
-        <w:t xml:space="preserve">19</w:t>
+        <w:t xml:space="preserve">20</w:t>
       </w:r>
     </w:p>
     <w:p>
@@ -979,7 +979,7 @@
           <w:sz w:val="21"/>
           <w:szCs w:val="21"/>
         </w:rPr>
-        <w:t xml:space="preserve">Outstanding Evaluations — who still needs to be evaluated</w:t>
+        <w:t xml:space="preserve">Raw Data Explorer — inspecting individual responses</w:t>
       </w:r>
       <w:r>
         <w:rPr>
@@ -1017,7 +1017,7 @@
           <w:sz w:val="21"/>
           <w:szCs w:val="21"/>
         </w:rPr>
-        <w:t xml:space="preserve">Raw Data Explorer — inspecting individual responses</w:t>
+        <w:t xml:space="preserve">Archive Center — retired forms and past-period responses</w:t>
       </w:r>
       <w:r>
         <w:rPr>
@@ -1035,7 +1035,7 @@
           <w:sz w:val="21"/>
           <w:szCs w:val="21"/>
         </w:rPr>
-        <w:t xml:space="preserve">22</w:t>
+        <w:t xml:space="preserve">21</w:t>
       </w:r>
     </w:p>
     <w:p>
@@ -1055,7 +1055,7 @@
           <w:sz w:val="21"/>
           <w:szCs w:val="21"/>
         </w:rPr>
-        <w:t xml:space="preserve">Archive Center — retired forms and past-period responses</w:t>
+        <w:t xml:space="preserve">Categories Manager — naming the scoring categories</w:t>
       </w:r>
       <w:r>
         <w:rPr>
@@ -1074,6 +1074,43 @@
           <w:szCs w:val="21"/>
         </w:rPr>
         <w:t xml:space="preserve">22</w:t>
+      </w:r>
+    </w:p>
+    <w:p>
+      <w:pPr>
+        <w:tabs>
+          <w:tab w:val="right" w:pos="9026" w:leader="dot"/>
+        </w:tabs>
+        <w:spacing w:after="120" w:before="160"/>
+      </w:pPr>
+      <w:r>
+        <w:rPr>
+          <w:rFonts w:ascii="Calibri" w:cs="Calibri" w:eastAsia="Calibri" w:hAnsi="Calibri"/>
+          <w:b/>
+          <w:bCs/>
+          <w:color w:val="0063A9"/>
+          <w:sz w:val="23"/>
+          <w:szCs w:val="23"/>
+        </w:rPr>
+        <w:t xml:space="preserve">Chapter 7: Analytics</w:t>
+      </w:r>
+      <w:r>
+        <w:rPr>
+          <w:sz w:val="21"/>
+          <w:szCs w:val="21"/>
+        </w:rPr>
+        <w:t xml:space="preserve">	</w:t>
+      </w:r>
+      <w:r>
+        <w:rPr>
+          <w:rFonts w:ascii="Calibri" w:cs="Calibri" w:eastAsia="Calibri" w:hAnsi="Calibri"/>
+          <w:b/>
+          <w:bCs/>
+          <w:color w:val="0063A9"/>
+          <w:sz w:val="23"/>
+          <w:szCs w:val="23"/>
+        </w:rPr>
+        <w:t xml:space="preserve">24</w:t>
       </w:r>
     </w:p>
     <w:p>
@@ -1093,7 +1130,7 @@
           <w:sz w:val="21"/>
           <w:szCs w:val="21"/>
         </w:rPr>
-        <w:t xml:space="preserve">Categories Manager — naming the scoring categories</w:t>
+        <w:t xml:space="preserve">What you will find on this page</w:t>
       </w:r>
       <w:r>
         <w:rPr>
@@ -1111,44 +1148,7 @@
           <w:sz w:val="21"/>
           <w:szCs w:val="21"/>
         </w:rPr>
-        <w:t xml:space="preserve">23</w:t>
-      </w:r>
-    </w:p>
-    <w:p>
-      <w:pPr>
-        <w:tabs>
-          <w:tab w:val="right" w:pos="9026" w:leader="dot"/>
-        </w:tabs>
-        <w:spacing w:after="120" w:before="160"/>
-      </w:pPr>
-      <w:r>
-        <w:rPr>
-          <w:rFonts w:ascii="Calibri" w:cs="Calibri" w:eastAsia="Calibri" w:hAnsi="Calibri"/>
-          <w:b/>
-          <w:bCs/>
-          <w:color w:val="0063A9"/>
-          <w:sz w:val="23"/>
-          <w:szCs w:val="23"/>
-        </w:rPr>
-        <w:t xml:space="preserve">Chapter 7: Analytics</w:t>
-      </w:r>
-      <w:r>
-        <w:rPr>
-          <w:sz w:val="21"/>
-          <w:szCs w:val="21"/>
-        </w:rPr>
-        <w:t xml:space="preserve">	</w:t>
-      </w:r>
-      <w:r>
-        <w:rPr>
-          <w:rFonts w:ascii="Calibri" w:cs="Calibri" w:eastAsia="Calibri" w:hAnsi="Calibri"/>
-          <w:b/>
-          <w:bCs/>
-          <w:color w:val="0063A9"/>
-          <w:sz w:val="23"/>
-          <w:szCs w:val="23"/>
-        </w:rPr>
-        <w:t xml:space="preserve">25</w:t>
+        <w:t xml:space="preserve">24</w:t>
       </w:r>
     </w:p>
     <w:p>
@@ -1168,7 +1168,7 @@
           <w:sz w:val="21"/>
           <w:szCs w:val="21"/>
         </w:rPr>
-        <w:t xml:space="preserve">What you will find on this page</w:t>
+        <w:t xml:space="preserve">Filtering what you see</w:t>
       </w:r>
       <w:r>
         <w:rPr>
@@ -1185,6 +1185,43 @@
           <w:color w:val="64748B"/>
           <w:sz w:val="21"/>
           <w:szCs w:val="21"/>
+        </w:rPr>
+        <w:t xml:space="preserve">24</w:t>
+      </w:r>
+    </w:p>
+    <w:p>
+      <w:pPr>
+        <w:tabs>
+          <w:tab w:val="right" w:pos="9026" w:leader="dot"/>
+        </w:tabs>
+        <w:spacing w:after="120" w:before="160"/>
+      </w:pPr>
+      <w:r>
+        <w:rPr>
+          <w:rFonts w:ascii="Calibri" w:cs="Calibri" w:eastAsia="Calibri" w:hAnsi="Calibri"/>
+          <w:b/>
+          <w:bCs/>
+          <w:color w:val="0063A9"/>
+          <w:sz w:val="23"/>
+          <w:szCs w:val="23"/>
+        </w:rPr>
+        <w:t xml:space="preserve">Chapter 8: Reports &amp; Exports</w:t>
+      </w:r>
+      <w:r>
+        <w:rPr>
+          <w:sz w:val="21"/>
+          <w:szCs w:val="21"/>
+        </w:rPr>
+        <w:t xml:space="preserve">	</w:t>
+      </w:r>
+      <w:r>
+        <w:rPr>
+          <w:rFonts w:ascii="Calibri" w:cs="Calibri" w:eastAsia="Calibri" w:hAnsi="Calibri"/>
+          <w:b/>
+          <w:bCs/>
+          <w:color w:val="0063A9"/>
+          <w:sz w:val="23"/>
+          <w:szCs w:val="23"/>
         </w:rPr>
         <w:t xml:space="preserve">25</w:t>
       </w:r>
@@ -1206,7 +1243,7 @@
           <w:sz w:val="21"/>
           <w:szCs w:val="21"/>
         </w:rPr>
-        <w:t xml:space="preserve">Filtering what you see</w:t>
+        <w:t xml:space="preserve">Generate Report — the reports hub</w:t>
       </w:r>
       <w:r>
         <w:rPr>
@@ -1225,43 +1262,6 @@
           <w:szCs w:val="21"/>
         </w:rPr>
         <w:t xml:space="preserve">25</w:t>
-      </w:r>
-    </w:p>
-    <w:p>
-      <w:pPr>
-        <w:tabs>
-          <w:tab w:val="right" w:pos="9026" w:leader="dot"/>
-        </w:tabs>
-        <w:spacing w:after="120" w:before="160"/>
-      </w:pPr>
-      <w:r>
-        <w:rPr>
-          <w:rFonts w:ascii="Calibri" w:cs="Calibri" w:eastAsia="Calibri" w:hAnsi="Calibri"/>
-          <w:b/>
-          <w:bCs/>
-          <w:color w:val="0063A9"/>
-          <w:sz w:val="23"/>
-          <w:szCs w:val="23"/>
-        </w:rPr>
-        <w:t xml:space="preserve">Chapter 8: Reports &amp; Exports</w:t>
-      </w:r>
-      <w:r>
-        <w:rPr>
-          <w:sz w:val="21"/>
-          <w:szCs w:val="21"/>
-        </w:rPr>
-        <w:t xml:space="preserve">	</w:t>
-      </w:r>
-      <w:r>
-        <w:rPr>
-          <w:rFonts w:ascii="Calibri" w:cs="Calibri" w:eastAsia="Calibri" w:hAnsi="Calibri"/>
-          <w:b/>
-          <w:bCs/>
-          <w:color w:val="0063A9"/>
-          <w:sz w:val="23"/>
-          <w:szCs w:val="23"/>
-        </w:rPr>
-        <w:t xml:space="preserve">26</w:t>
       </w:r>
     </w:p>
     <w:p>
@@ -1281,7 +1281,7 @@
           <w:sz w:val="21"/>
           <w:szCs w:val="21"/>
         </w:rPr>
-        <w:t xml:space="preserve">Generate Report — the reports hub</w:t>
+        <w:t xml:space="preserve">Building and exporting a Summary Report</w:t>
       </w:r>
       <w:r>
         <w:rPr>
@@ -1299,7 +1299,7 @@
           <w:sz w:val="21"/>
           <w:szCs w:val="21"/>
         </w:rPr>
-        <w:t xml:space="preserve">26</w:t>
+        <w:t xml:space="preserve">25</w:t>
       </w:r>
     </w:p>
     <w:p>
@@ -1319,7 +1319,7 @@
           <w:sz w:val="21"/>
           <w:szCs w:val="21"/>
         </w:rPr>
-        <w:t xml:space="preserve">Building and exporting a Summary Report</w:t>
+        <w:t xml:space="preserve">Building and exporting an Executive Summary Dossier</w:t>
       </w:r>
       <w:r>
         <w:rPr>
@@ -1337,7 +1337,7 @@
           <w:sz w:val="21"/>
           <w:szCs w:val="21"/>
         </w:rPr>
-        <w:t xml:space="preserve">26</w:t>
+        <w:t xml:space="preserve">25</w:t>
       </w:r>
     </w:p>
     <w:p>
@@ -1357,7 +1357,7 @@
           <w:sz w:val="21"/>
           <w:szCs w:val="21"/>
         </w:rPr>
-        <w:t xml:space="preserve">Building and exporting an Executive Summary Dossier</w:t>
+        <w:t xml:space="preserve">Building and exporting a Question Report</w:t>
       </w:r>
       <w:r>
         <w:rPr>
@@ -1395,7 +1395,7 @@
           <w:sz w:val="21"/>
           <w:szCs w:val="21"/>
         </w:rPr>
-        <w:t xml:space="preserve">Building and exporting a Question Report</w:t>
+        <w:t xml:space="preserve">Building and exporting a Companies Report</w:t>
       </w:r>
       <w:r>
         <w:rPr>
@@ -1413,7 +1413,7 @@
           <w:sz w:val="21"/>
           <w:szCs w:val="21"/>
         </w:rPr>
-        <w:t xml:space="preserve">27</w:t>
+        <w:t xml:space="preserve">26</w:t>
       </w:r>
     </w:p>
     <w:p>
@@ -1433,7 +1433,7 @@
           <w:sz w:val="21"/>
           <w:szCs w:val="21"/>
         </w:rPr>
-        <w:t xml:space="preserve">Building and exporting a Companies Report</w:t>
+        <w:t xml:space="preserve">Exporting Raw Data</w:t>
       </w:r>
       <w:r>
         <w:rPr>
@@ -1451,7 +1451,7 @@
           <w:sz w:val="21"/>
           <w:szCs w:val="21"/>
         </w:rPr>
-        <w:t xml:space="preserve">27</w:t>
+        <w:t xml:space="preserve">26</w:t>
       </w:r>
     </w:p>
     <w:p>
@@ -1471,7 +1471,7 @@
           <w:sz w:val="21"/>
           <w:szCs w:val="21"/>
         </w:rPr>
-        <w:t xml:space="preserve">Exporting Raw Data</w:t>
+        <w:t xml:space="preserve">Present Mode — turning data into a slideshow</w:t>
       </w:r>
       <w:r>
         <w:rPr>
@@ -1509,7 +1509,7 @@
           <w:sz w:val="21"/>
           <w:szCs w:val="21"/>
         </w:rPr>
-        <w:t xml:space="preserve">Present Mode — turning data into a slideshow</w:t>
+        <w:t xml:space="preserve">Export History — your download log</w:t>
       </w:r>
       <w:r>
         <w:rPr>
@@ -1528,6 +1528,43 @@
           <w:szCs w:val="21"/>
         </w:rPr>
         <w:t xml:space="preserve">27</w:t>
+      </w:r>
+    </w:p>
+    <w:p>
+      <w:pPr>
+        <w:tabs>
+          <w:tab w:val="right" w:pos="9026" w:leader="dot"/>
+        </w:tabs>
+        <w:spacing w:after="120" w:before="160"/>
+      </w:pPr>
+      <w:r>
+        <w:rPr>
+          <w:rFonts w:ascii="Calibri" w:cs="Calibri" w:eastAsia="Calibri" w:hAnsi="Calibri"/>
+          <w:b/>
+          <w:bCs/>
+          <w:color w:val="0063A9"/>
+          <w:sz w:val="23"/>
+          <w:szCs w:val="23"/>
+        </w:rPr>
+        <w:t xml:space="preserve">Chapter 9: Employees / Users</w:t>
+      </w:r>
+      <w:r>
+        <w:rPr>
+          <w:sz w:val="21"/>
+          <w:szCs w:val="21"/>
+        </w:rPr>
+        <w:t xml:space="preserve">	</w:t>
+      </w:r>
+      <w:r>
+        <w:rPr>
+          <w:rFonts w:ascii="Calibri" w:cs="Calibri" w:eastAsia="Calibri" w:hAnsi="Calibri"/>
+          <w:b/>
+          <w:bCs/>
+          <w:color w:val="0063A9"/>
+          <w:sz w:val="23"/>
+          <w:szCs w:val="23"/>
+        </w:rPr>
+        <w:t xml:space="preserve">28</w:t>
       </w:r>
     </w:p>
     <w:p>
@@ -1547,7 +1584,7 @@
           <w:sz w:val="21"/>
           <w:szCs w:val="21"/>
         </w:rPr>
-        <w:t xml:space="preserve">Export History — your download log</w:t>
+        <w:t xml:space="preserve">Understanding the account list</w:t>
       </w:r>
       <w:r>
         <w:rPr>
@@ -1566,43 +1603,6 @@
           <w:szCs w:val="21"/>
         </w:rPr>
         <w:t xml:space="preserve">28</w:t>
-      </w:r>
-    </w:p>
-    <w:p>
-      <w:pPr>
-        <w:tabs>
-          <w:tab w:val="right" w:pos="9026" w:leader="dot"/>
-        </w:tabs>
-        <w:spacing w:after="120" w:before="160"/>
-      </w:pPr>
-      <w:r>
-        <w:rPr>
-          <w:rFonts w:ascii="Calibri" w:cs="Calibri" w:eastAsia="Calibri" w:hAnsi="Calibri"/>
-          <w:b/>
-          <w:bCs/>
-          <w:color w:val="0063A9"/>
-          <w:sz w:val="23"/>
-          <w:szCs w:val="23"/>
-        </w:rPr>
-        <w:t xml:space="preserve">Chapter 9: Employees / Users</w:t>
-      </w:r>
-      <w:r>
-        <w:rPr>
-          <w:sz w:val="21"/>
-          <w:szCs w:val="21"/>
-        </w:rPr>
-        <w:t xml:space="preserve">	</w:t>
-      </w:r>
-      <w:r>
-        <w:rPr>
-          <w:rFonts w:ascii="Calibri" w:cs="Calibri" w:eastAsia="Calibri" w:hAnsi="Calibri"/>
-          <w:b/>
-          <w:bCs/>
-          <w:color w:val="0063A9"/>
-          <w:sz w:val="23"/>
-          <w:szCs w:val="23"/>
-        </w:rPr>
-        <w:t xml:space="preserve">29</w:t>
       </w:r>
     </w:p>
     <w:p>
@@ -1622,7 +1622,7 @@
           <w:sz w:val="21"/>
           <w:szCs w:val="21"/>
         </w:rPr>
-        <w:t xml:space="preserve">Understanding the account list</w:t>
+        <w:t xml:space="preserve">Adding a new employee account</w:t>
       </w:r>
       <w:r>
         <w:rPr>
@@ -1640,7 +1640,7 @@
           <w:sz w:val="21"/>
           <w:szCs w:val="21"/>
         </w:rPr>
-        <w:t xml:space="preserve">29</w:t>
+        <w:t xml:space="preserve">28</w:t>
       </w:r>
     </w:p>
     <w:p>
@@ -1660,7 +1660,7 @@
           <w:sz w:val="21"/>
           <w:szCs w:val="21"/>
         </w:rPr>
-        <w:t xml:space="preserve">Adding a new employee account</w:t>
+        <w:t xml:space="preserve">Assigning or changing an employee’s permissions</w:t>
       </w:r>
       <w:r>
         <w:rPr>
@@ -1678,7 +1678,7 @@
           <w:sz w:val="21"/>
           <w:szCs w:val="21"/>
         </w:rPr>
-        <w:t xml:space="preserve">29</w:t>
+        <w:t xml:space="preserve">28</w:t>
       </w:r>
     </w:p>
     <w:p>
@@ -1698,7 +1698,7 @@
           <w:sz w:val="21"/>
           <w:szCs w:val="21"/>
         </w:rPr>
-        <w:t xml:space="preserve">Assigning or changing an employee’s permissions</w:t>
+        <w:t xml:space="preserve">Editing or removing an account</w:t>
       </w:r>
       <w:r>
         <w:rPr>
@@ -1717,6 +1717,43 @@
           <w:szCs w:val="21"/>
         </w:rPr>
         <w:t xml:space="preserve">29</w:t>
+      </w:r>
+    </w:p>
+    <w:p>
+      <w:pPr>
+        <w:tabs>
+          <w:tab w:val="right" w:pos="9026" w:leader="dot"/>
+        </w:tabs>
+        <w:spacing w:after="120" w:before="160"/>
+      </w:pPr>
+      <w:r>
+        <w:rPr>
+          <w:rFonts w:ascii="Calibri" w:cs="Calibri" w:eastAsia="Calibri" w:hAnsi="Calibri"/>
+          <w:b/>
+          <w:bCs/>
+          <w:color w:val="0063A9"/>
+          <w:sz w:val="23"/>
+          <w:szCs w:val="23"/>
+        </w:rPr>
+        <w:t xml:space="preserve">Chapter 10: Notifications</w:t>
+      </w:r>
+      <w:r>
+        <w:rPr>
+          <w:sz w:val="21"/>
+          <w:szCs w:val="21"/>
+        </w:rPr>
+        <w:t xml:space="preserve">	</w:t>
+      </w:r>
+      <w:r>
+        <w:rPr>
+          <w:rFonts w:ascii="Calibri" w:cs="Calibri" w:eastAsia="Calibri" w:hAnsi="Calibri"/>
+          <w:b/>
+          <w:bCs/>
+          <w:color w:val="0063A9"/>
+          <w:sz w:val="23"/>
+          <w:szCs w:val="23"/>
+        </w:rPr>
+        <w:t xml:space="preserve">30</w:t>
       </w:r>
     </w:p>
     <w:p>
@@ -1736,7 +1773,7 @@
           <w:sz w:val="21"/>
           <w:szCs w:val="21"/>
         </w:rPr>
-        <w:t xml:space="preserve">Editing or removing an account</w:t>
+        <w:t xml:space="preserve">Reading the activity log</w:t>
       </w:r>
       <w:r>
         <w:rPr>
@@ -1755,43 +1792,6 @@
           <w:szCs w:val="21"/>
         </w:rPr>
         <w:t xml:space="preserve">30</w:t>
-      </w:r>
-    </w:p>
-    <w:p>
-      <w:pPr>
-        <w:tabs>
-          <w:tab w:val="right" w:pos="9026" w:leader="dot"/>
-        </w:tabs>
-        <w:spacing w:after="120" w:before="160"/>
-      </w:pPr>
-      <w:r>
-        <w:rPr>
-          <w:rFonts w:ascii="Calibri" w:cs="Calibri" w:eastAsia="Calibri" w:hAnsi="Calibri"/>
-          <w:b/>
-          <w:bCs/>
-          <w:color w:val="0063A9"/>
-          <w:sz w:val="23"/>
-          <w:szCs w:val="23"/>
-        </w:rPr>
-        <w:t xml:space="preserve">Chapter 10: Notifications</w:t>
-      </w:r>
-      <w:r>
-        <w:rPr>
-          <w:sz w:val="21"/>
-          <w:szCs w:val="21"/>
-        </w:rPr>
-        <w:t xml:space="preserve">	</w:t>
-      </w:r>
-      <w:r>
-        <w:rPr>
-          <w:rFonts w:ascii="Calibri" w:cs="Calibri" w:eastAsia="Calibri" w:hAnsi="Calibri"/>
-          <w:b/>
-          <w:bCs/>
-          <w:color w:val="0063A9"/>
-          <w:sz w:val="23"/>
-          <w:szCs w:val="23"/>
-        </w:rPr>
-        <w:t xml:space="preserve">31</w:t>
       </w:r>
     </w:p>
     <w:p>
@@ -1811,7 +1811,7 @@
           <w:sz w:val="21"/>
           <w:szCs w:val="21"/>
         </w:rPr>
-        <w:t xml:space="preserve">Reading the activity log</w:t>
+        <w:t xml:space="preserve">Where to configure alert timing and reminders</w:t>
       </w:r>
       <w:r>
         <w:rPr>
@@ -1829,7 +1829,44 @@
           <w:sz w:val="21"/>
           <w:szCs w:val="21"/>
         </w:rPr>
-        <w:t xml:space="preserve">31</w:t>
+        <w:t xml:space="preserve">30</w:t>
+      </w:r>
+    </w:p>
+    <w:p>
+      <w:pPr>
+        <w:tabs>
+          <w:tab w:val="right" w:pos="9026" w:leader="dot"/>
+        </w:tabs>
+        <w:spacing w:after="120" w:before="160"/>
+      </w:pPr>
+      <w:r>
+        <w:rPr>
+          <w:rFonts w:ascii="Calibri" w:cs="Calibri" w:eastAsia="Calibri" w:hAnsi="Calibri"/>
+          <w:b/>
+          <w:bCs/>
+          <w:color w:val="0063A9"/>
+          <w:sz w:val="23"/>
+          <w:szCs w:val="23"/>
+        </w:rPr>
+        <w:t xml:space="preserve">Chapter 11: Settings</w:t>
+      </w:r>
+      <w:r>
+        <w:rPr>
+          <w:sz w:val="21"/>
+          <w:szCs w:val="21"/>
+        </w:rPr>
+        <w:t xml:space="preserve">	</w:t>
+      </w:r>
+      <w:r>
+        <w:rPr>
+          <w:rFonts w:ascii="Calibri" w:cs="Calibri" w:eastAsia="Calibri" w:hAnsi="Calibri"/>
+          <w:b/>
+          <w:bCs/>
+          <w:color w:val="0063A9"/>
+          <w:sz w:val="23"/>
+          <w:szCs w:val="23"/>
+        </w:rPr>
+        <w:t xml:space="preserve">32</w:t>
       </w:r>
     </w:p>
     <w:p>
@@ -1849,7 +1886,7 @@
           <w:sz w:val="21"/>
           <w:szCs w:val="21"/>
         </w:rPr>
-        <w:t xml:space="preserve">Where to configure alert timing and reminders</w:t>
+        <w:t xml:space="preserve">System Snapshot and Account</w:t>
       </w:r>
       <w:r>
         <w:rPr>
@@ -1867,44 +1904,7 @@
           <w:sz w:val="21"/>
           <w:szCs w:val="21"/>
         </w:rPr>
-        <w:t xml:space="preserve">31</w:t>
-      </w:r>
-    </w:p>
-    <w:p>
-      <w:pPr>
-        <w:tabs>
-          <w:tab w:val="right" w:pos="9026" w:leader="dot"/>
-        </w:tabs>
-        <w:spacing w:after="120" w:before="160"/>
-      </w:pPr>
-      <w:r>
-        <w:rPr>
-          <w:rFonts w:ascii="Calibri" w:cs="Calibri" w:eastAsia="Calibri" w:hAnsi="Calibri"/>
-          <w:b/>
-          <w:bCs/>
-          <w:color w:val="0063A9"/>
-          <w:sz w:val="23"/>
-          <w:szCs w:val="23"/>
-        </w:rPr>
-        <w:t xml:space="preserve">Chapter 11: Settings</w:t>
-      </w:r>
-      <w:r>
-        <w:rPr>
-          <w:sz w:val="21"/>
-          <w:szCs w:val="21"/>
-        </w:rPr>
-        <w:t xml:space="preserve">	</w:t>
-      </w:r>
-      <w:r>
-        <w:rPr>
-          <w:rFonts w:ascii="Calibri" w:cs="Calibri" w:eastAsia="Calibri" w:hAnsi="Calibri"/>
-          <w:b/>
-          <w:bCs/>
-          <w:color w:val="0063A9"/>
-          <w:sz w:val="23"/>
-          <w:szCs w:val="23"/>
-        </w:rPr>
-        <w:t xml:space="preserve">33</w:t>
+        <w:t xml:space="preserve">32</w:t>
       </w:r>
     </w:p>
     <w:p>
@@ -1924,7 +1924,7 @@
           <w:sz w:val="21"/>
           <w:szCs w:val="21"/>
         </w:rPr>
-        <w:t xml:space="preserve">System Snapshot and Account</w:t>
+        <w:t xml:space="preserve">Appearance</w:t>
       </w:r>
       <w:r>
         <w:rPr>
@@ -1942,7 +1942,7 @@
           <w:sz w:val="21"/>
           <w:szCs w:val="21"/>
         </w:rPr>
-        <w:t xml:space="preserve">33</w:t>
+        <w:t xml:space="preserve">32</w:t>
       </w:r>
     </w:p>
     <w:p>
@@ -1962,7 +1962,7 @@
           <w:sz w:val="21"/>
           <w:szCs w:val="21"/>
         </w:rPr>
-        <w:t xml:space="preserve">Appearance</w:t>
+        <w:t xml:space="preserve">System Tools</w:t>
       </w:r>
       <w:r>
         <w:rPr>
@@ -1980,7 +1980,7 @@
           <w:sz w:val="21"/>
           <w:szCs w:val="21"/>
         </w:rPr>
-        <w:t xml:space="preserve">33</w:t>
+        <w:t xml:space="preserve">32</w:t>
       </w:r>
     </w:p>
     <w:p>
@@ -2000,7 +2000,7 @@
           <w:sz w:val="21"/>
           <w:szCs w:val="21"/>
         </w:rPr>
-        <w:t xml:space="preserve">System Tools</w:t>
+        <w:t xml:space="preserve">Session and Recent Activity</w:t>
       </w:r>
       <w:r>
         <w:rPr>
@@ -2019,44 +2019,6 @@
           <w:szCs w:val="21"/>
         </w:rPr>
         <w:t xml:space="preserve">33</w:t>
-      </w:r>
-    </w:p>
-    <w:p>
-      <w:pPr>
-        <w:tabs>
-          <w:tab w:val="right" w:pos="9026" w:leader="dot"/>
-        </w:tabs>
-        <w:spacing w:after="70" w:before="0"/>
-        <w:ind w:left="431"/>
-      </w:pPr>
-      <w:r>
-        <w:rPr>
-          <w:rFonts w:ascii="Calibri" w:cs="Calibri" w:eastAsia="Calibri" w:hAnsi="Calibri"/>
-          <w:b w:val="false"/>
-          <w:bCs w:val="false"/>
-          <w:color w:val="334155"/>
-          <w:sz w:val="21"/>
-          <w:szCs w:val="21"/>
-        </w:rPr>
-        <w:t xml:space="preserve">Session and Recent Activity</w:t>
-      </w:r>
-      <w:r>
-        <w:rPr>
-          <w:sz w:val="21"/>
-          <w:szCs w:val="21"/>
-        </w:rPr>
-        <w:t xml:space="preserve">	</w:t>
-      </w:r>
-      <w:r>
-        <w:rPr>
-          <w:rFonts w:ascii="Calibri" w:cs="Calibri" w:eastAsia="Calibri" w:hAnsi="Calibri"/>
-          <w:b w:val="false"/>
-          <w:bCs w:val="false"/>
-          <w:color w:val="64748B"/>
-          <w:sz w:val="21"/>
-          <w:szCs w:val="21"/>
-        </w:rPr>
-        <w:t xml:space="preserve">34</w:t>
       </w:r>
     </w:p>
     <w:p>
@@ -2093,7 +2055,7 @@
           <w:sz w:val="23"/>
           <w:szCs w:val="23"/>
         </w:rPr>
-        <w:t xml:space="preserve">35</w:t>
+        <w:t xml:space="preserve">34</w:t>
       </w:r>
     </w:p>
     <w:p>
@@ -3254,7 +3216,7 @@
           <w:sz w:val="21"/>
           <w:szCs w:val="21"/>
         </w:rPr>
-        <w:t xml:space="preserve">Partner Companies (a group that expands to: Partner Companies, Document Tracker, Supplier Ranking, Feedback Hub)</w:t>
+        <w:t xml:space="preserve">Partner Companies (a group that expands to: Partner Companies, Document Tracker, Feedback Hub)</w:t>
       </w:r>
     </w:p>
     <w:p>
@@ -4097,7 +4059,7 @@
           <w:sz w:val="21"/>
           <w:szCs w:val="21"/>
         </w:rPr>
-        <w:t xml:space="preserve">This chapter covers the "Partner Companies" group in the sidebar, which contains four related pages: Partner Companies (the main company directory), Document Tracker, Supplier Ranking, and Feedback Hub.</w:t>
+        <w:t xml:space="preserve">This chapter covers the "Partner Companies" group in the sidebar, which contains three related pages: Partner Companies (the main company directory), Document Tracker, and Feedback Hub.</w:t>
       </w:r>
     </w:p>
     <w:p>
@@ -5859,279 +5821,6 @@
           <w:sz w:val="26"/>
           <w:szCs w:val="26"/>
         </w:rPr>
-        <w:t xml:space="preserve">Supplier Ranking — choosing your Top 20 evaluable Suppliers</w:t>
-      </w:r>
-    </w:p>
-    <w:tbl>
-      <w:tblPr>
-        <w:tblW w:type="pct" w:w="100%"/>
-        <w:tblBorders>
-          <w:top w:val="single" w:color="93C5FD" w:sz="4"/>
-          <w:left w:val="single" w:color="93C5FD" w:sz="16"/>
-          <w:bottom w:val="single" w:color="93C5FD" w:sz="4"/>
-          <w:right w:val="single" w:color="93C5FD" w:sz="4"/>
-          <w:insideH w:val="single" w:color="auto" w:sz="4"/>
-          <w:insideV w:val="single" w:color="auto" w:sz="4"/>
-        </w:tblBorders>
-      </w:tblPr>
-      <w:tblGrid>
-        <w:gridCol w:w="9360"/>
-      </w:tblGrid>
-      <w:tr>
-        <w:tc>
-          <w:tcPr>
-            <w:tcW w:type="pct" w:w="100%"/>
-            <w:shd w:fill="EFF6FF" w:color="auto" w:val="clear"/>
-            <w:tcMar>
-              <w:top w:type="dxa" w:w="140"/>
-              <w:left w:type="dxa" w:w="200"/>
-              <w:bottom w:type="dxa" w:w="140"/>
-              <w:right w:type="dxa" w:w="200"/>
-            </w:tcMar>
-          </w:tcPr>
-          <w:p>
-            <w:pPr>
-              <w:spacing w:after="40"/>
-            </w:pPr>
-            <w:r>
-              <w:rPr>
-                <w:rFonts w:ascii="Calibri" w:cs="Calibri" w:eastAsia="Calibri" w:hAnsi="Calibri"/>
-                <w:b/>
-                <w:bCs/>
-                <w:color w:val="1E40AF"/>
-                <w:sz w:val="19"/>
-                <w:szCs w:val="19"/>
-              </w:rPr>
-              <w:t xml:space="preserve">ℹ NOTE</w:t>
-            </w:r>
-          </w:p>
-          <w:p>
-            <w:pPr>
-              <w:spacing w:after="0" w:line="264"/>
-            </w:pPr>
-            <w:r>
-              <w:rPr>
-                <w:rFonts w:ascii="Calibri" w:cs="Calibri" w:eastAsia="Calibri" w:hAnsi="Calibri"/>
-                <w:color w:val="1E40AF"/>
-                <w:sz w:val="20"/>
-                <w:szCs w:val="20"/>
-              </w:rPr>
-              <w:t xml:space="preserve">Despite the name, this page does not show a performance leaderboard or calculate scores — that is what the Analytics page (Chapter 7) is for. Supplier Ranking is where you manually decide which 20 Supplier companies employees are allowed to evaluate on survey forms.</w:t>
-            </w:r>
-          </w:p>
-        </w:tc>
-      </w:tr>
-    </w:tbl>
-    <w:p>
-      <w:pPr>
-        <w:spacing w:after="160"/>
-      </w:pPr>
-    </w:p>
-    <w:p>
-      <w:pPr>
-        <w:spacing w:after="160" w:line="288"/>
-      </w:pPr>
-      <w:r>
-        <w:rPr>
-          <w:rFonts w:ascii="Calibri" w:cs="Calibri" w:eastAsia="Calibri" w:hAnsi="Calibri"/>
-          <w:color w:val="334155"/>
-          <w:sz w:val="21"/>
-          <w:szCs w:val="21"/>
-        </w:rPr>
-        <w:t xml:space="preserve">The page shows 20 numbered slots. Each slot has a dropdown where you assign one Supplier company to that rank position. Any Supplier not currently in one of the 20 slots appears in a "Not in Top 20" list on the right, which you can search.</w:t>
-      </w:r>
-    </w:p>
-    <w:p>
-      <w:pPr>
-        <w:pStyle w:val="Heading3"/>
-        <w:spacing w:after="100" w:before="220"/>
-      </w:pPr>
-      <w:r>
-        <w:rPr>
-          <w:rFonts w:ascii="Calibri" w:cs="Calibri" w:eastAsia="Calibri" w:hAnsi="Calibri"/>
-          <w:b/>
-          <w:bCs/>
-          <w:color w:val="1E293B"/>
-          <w:sz w:val="22"/>
-          <w:szCs w:val="22"/>
-        </w:rPr>
-        <w:t xml:space="preserve">Changing the Top 20</w:t>
-      </w:r>
-    </w:p>
-    <w:p>
-      <w:pPr>
-        <w:pStyle w:val="ListParagraph"/>
-        <w:numPr>
-          <w:ilvl w:val="0"/>
-          <w:numId w:val="3"/>
-        </w:numPr>
-        <w:spacing w:after="110" w:line="280"/>
-      </w:pPr>
-      <w:r>
-        <w:rPr>
-          <w:rFonts w:ascii="Calibri" w:cs="Calibri" w:eastAsia="Calibri" w:hAnsi="Calibri"/>
-          <w:color w:val="334155"/>
-          <w:sz w:val="21"/>
-          <w:szCs w:val="21"/>
-        </w:rPr>
-        <w:t xml:space="preserve">Go to Supplier Ranking.</w:t>
-      </w:r>
-    </w:p>
-    <w:p>
-      <w:pPr>
-        <w:pStyle w:val="ListParagraph"/>
-        <w:numPr>
-          <w:ilvl w:val="0"/>
-          <w:numId w:val="3"/>
-        </w:numPr>
-        <w:spacing w:after="110" w:line="280"/>
-      </w:pPr>
-      <w:r>
-        <w:rPr>
-          <w:rFonts w:ascii="Calibri" w:cs="Calibri" w:eastAsia="Calibri" w:hAnsi="Calibri"/>
-          <w:color w:val="334155"/>
-          <w:sz w:val="21"/>
-          <w:szCs w:val="21"/>
-        </w:rPr>
-        <w:t xml:space="preserve">For any slot (1 through 20), use its dropdown to choose which Supplier company should occupy that rank.</w:t>
-      </w:r>
-    </w:p>
-    <w:p>
-      <w:pPr>
-        <w:pStyle w:val="ListParagraph"/>
-        <w:numPr>
-          <w:ilvl w:val="0"/>
-          <w:numId w:val="3"/>
-        </w:numPr>
-        <w:spacing w:after="110" w:line="280"/>
-      </w:pPr>
-      <w:r>
-        <w:rPr>
-          <w:rFonts w:ascii="Calibri" w:cs="Calibri" w:eastAsia="Calibri" w:hAnsi="Calibri"/>
-          <w:color w:val="334155"/>
-          <w:sz w:val="21"/>
-          <w:szCs w:val="21"/>
-        </w:rPr>
-        <w:t xml:space="preserve">Optionally drag rows using the grip handle to reorder them.</w:t>
-      </w:r>
-    </w:p>
-    <w:p>
-      <w:pPr>
-        <w:pStyle w:val="ListParagraph"/>
-        <w:numPr>
-          <w:ilvl w:val="0"/>
-          <w:numId w:val="3"/>
-        </w:numPr>
-        <w:spacing w:after="110" w:line="280"/>
-      </w:pPr>
-      <w:r>
-        <w:rPr>
-          <w:rFonts w:ascii="Calibri" w:cs="Calibri" w:eastAsia="Calibri" w:hAnsi="Calibri"/>
-          <w:color w:val="334155"/>
-          <w:sz w:val="21"/>
-          <w:szCs w:val="21"/>
-        </w:rPr>
-        <w:t xml:space="preserve">Click "Save Changes" once you are happy with the list. If you want to start over, click "Reset Rankings" first, or "Cancel" to discard your edits entirely.</w:t>
-      </w:r>
-    </w:p>
-    <w:p>
-      <w:pPr>
-        <w:spacing w:after="60"/>
-      </w:pPr>
-    </w:p>
-    <w:tbl>
-      <w:tblPr>
-        <w:tblW w:type="pct" w:w="100%"/>
-        <w:tblBorders>
-          <w:top w:val="single" w:color="FCA5A5" w:sz="4"/>
-          <w:left w:val="single" w:color="FCA5A5" w:sz="16"/>
-          <w:bottom w:val="single" w:color="FCA5A5" w:sz="4"/>
-          <w:right w:val="single" w:color="FCA5A5" w:sz="4"/>
-          <w:insideH w:val="single" w:color="auto" w:sz="4"/>
-          <w:insideV w:val="single" w:color="auto" w:sz="4"/>
-        </w:tblBorders>
-      </w:tblPr>
-      <w:tblGrid>
-        <w:gridCol w:w="9360"/>
-      </w:tblGrid>
-      <w:tr>
-        <w:tc>
-          <w:tcPr>
-            <w:tcW w:type="pct" w:w="100%"/>
-            <w:shd w:fill="FEF2F2" w:color="auto" w:val="clear"/>
-            <w:tcMar>
-              <w:top w:type="dxa" w:w="140"/>
-              <w:left w:type="dxa" w:w="200"/>
-              <w:bottom w:type="dxa" w:w="140"/>
-              <w:right w:type="dxa" w:w="200"/>
-            </w:tcMar>
-          </w:tcPr>
-          <w:p>
-            <w:pPr>
-              <w:spacing w:after="40"/>
-            </w:pPr>
-            <w:r>
-              <w:rPr>
-                <w:rFonts w:ascii="Calibri" w:cs="Calibri" w:eastAsia="Calibri" w:hAnsi="Calibri"/>
-                <w:b/>
-                <w:bCs/>
-                <w:color w:val="991B1B"/>
-                <w:sz w:val="19"/>
-                <w:szCs w:val="19"/>
-              </w:rPr>
-              <w:t xml:space="preserve">⚠ IMPORTANT</w:t>
-            </w:r>
-          </w:p>
-          <w:p>
-            <w:pPr>
-              <w:spacing w:after="0" w:line="264"/>
-            </w:pPr>
-            <w:r>
-              <w:rPr>
-                <w:rFonts w:ascii="Calibri" w:cs="Calibri" w:eastAsia="Calibri" w:hAnsi="Calibri"/>
-                <w:color w:val="991B1B"/>
-                <w:sz w:val="20"/>
-                <w:szCs w:val="20"/>
-              </w:rPr>
-              <w:t xml:space="preserve">If a Supplier survey is currently active and already has submissions, the system will block your save with a warning ("Supplier Evaluation Still Ongoing") — you will need to pause or reset that survey first before changing the Top 20 mid-cycle.</w:t>
-            </w:r>
-          </w:p>
-        </w:tc>
-      </w:tr>
-    </w:tbl>
-    <w:p>
-      <w:pPr>
-        <w:spacing w:after="160"/>
-      </w:pPr>
-    </w:p>
-    <w:p>
-      <w:pPr>
-        <w:spacing w:after="160" w:line="288"/>
-      </w:pPr>
-      <w:r>
-        <w:rPr>
-          <w:rFonts w:ascii="Calibri" w:cs="Calibri" w:eastAsia="Calibri" w:hAnsi="Calibri"/>
-          <w:color w:val="334155"/>
-          <w:sz w:val="21"/>
-          <w:szCs w:val="21"/>
-        </w:rPr>
-        <w:t xml:space="preserve">A "Modification Log" at the bottom of the page records every change made to the Top 20 over time, including who made it and when — click any entry to see a full snapshot of the list as it looked at that moment.</w:t>
-      </w:r>
-    </w:p>
-    <w:p>
-      <w:pPr>
-        <w:pStyle w:val="Heading2"/>
-        <w:spacing w:after="140" w:before="320"/>
-      </w:pPr>
-      <w:r>
-        <w:rPr>
-          <w:rFonts w:ascii="Calibri" w:cs="Calibri" w:eastAsia="Calibri" w:hAnsi="Calibri"/>
-          <w:b/>
-          <w:bCs/>
-          <w:color w:val="0063A9"/>
-          <w:sz w:val="26"/>
-          <w:szCs w:val="26"/>
-        </w:rPr>
         <w:t xml:space="preserve">Feedback Hub — sending performance reports to partner companies</w:t>
       </w:r>
     </w:p>
@@ -7213,7 +6902,7 @@
           <w:sz w:val="21"/>
           <w:szCs w:val="21"/>
         </w:rPr>
-        <w:t xml:space="preserve">If you need to change which specific partner companies this survey covers, click "Modify Companies to Evaluate" and tick/untick companies from the full list.</w:t>
+        <w:t xml:space="preserve">If you need to change which partner companies this survey covers, click "Modify Companies to Evaluate". For Supplier surveys, choose "Within Top 20" to select up to 20 active suppliers from the current official, volume-weighted Analytics leaderboard, choose "Active Companies" for all active suppliers, or tick companies individually.</w:t>
       </w:r>
     </w:p>
     <w:p>
@@ -12179,7 +11868,7 @@
           <w:sz w:val="21"/>
           <w:szCs w:val="21"/>
         </w:rPr>
-        <w:t xml:space="preserve">How do I choose which 20 Suppliers can be evaluated?</w:t>
+        <w:t xml:space="preserve">How do I choose which Suppliers can be evaluated?</w:t>
       </w:r>
     </w:p>
     <w:p>
@@ -12205,7 +11894,7 @@
           <w:sz w:val="21"/>
           <w:szCs w:val="21"/>
         </w:rPr>
-        <w:t xml:space="preserve">Go to Supplier Ranking, assign companies to the 20 ranked slots using each slot’s dropdown, and click "Save Changes". See Chapter 5, Supplier Ranking.</w:t>
+        <w:t xml:space="preserve">In Evaluation Workspace, click "Modify" on the Supplier survey, open "Modify Companies to Evaluate", choose "Within Top 20" or "Active Companies", or select companies individually, then save the survey changes. The saved company IDs determine which suppliers employees can rate. See Chapter 6, Evaluations.</w:t>
       </w:r>
     </w:p>
     <w:p>

</xml_diff>